<commit_message>
Record Howard-approved replacements and three remaining prospective-question overlaps
</commit_message>
<xml_diff>
--- a/revisions/reviewer_2_20261029/manuscript_clean.docx
+++ b/revisions/reviewer_2_20261029/manuscript_clean.docx
@@ -700,12 +700,17 @@
     </w:p>
     <w:p>
       <w:r>
-        <w:t>The sibling diagnostic evaluates a development-exposed rule on known questions. Expansion changes the amount, content and order of selected evidence together; it does not isolate length or guarantee that every added clause is needed. Article labels can remain unchanged while evidence sufficiency changes. Automated completeness uses archived references and the same model as generation; it is not human verification or current-law accuracy. The archived corpus-answerability refusal score is not interpreted as justification of refusal given the exact selected passages. Human review separates passage sufficiency, completeness of supported information and refusal of unavailable detail. A 40-row AI-authored, Howard-approved question set has been submitted, but overlap screening identified six pairs requiring replacement before freezing; no validation outputs have been generated. His coauthor role and earlier exposure prevent calling it independent external validation.</w:t>
+        <w:t>The sibling diagnostic evaluates a development-exposed rule on known questions. Expansion changes the amount, content and order of selected evidence together; it does not isolate length or guarantee that every added clause is needed. Article labels can remain unchanged while evidence sufficiency changes. Automated completeness uses archived references and the same model as generation; it is not human verification or current-law accuracy. The archived corpus-answerability refusal score is not interpreted as justification of refusal given the exact selected passages. Human review separates passage sufficiency, completeness of supported information and refusal of unavailable detail. The initial 40-row AI-authored, Howard-approved question set required six pair replacements. After a subsequent replacement submission, three pairs still require replacement before freezing; no validation outputs have been generated. His coauthor role and earlier exposure prevent calling it independent external validation.</w:t>
       </w:r>
     </w:p>
     <w:p>
       <w:r>
         <w:t>The submitted file explicitly attributes all questions and references to Claude after exposure to the earlier 94-output and 44-output materials. The corresponding author confirmed that Howard personally reviewed and approved all 40 rows. This is an AI-authored, coauthor-reviewed candidate set, not independently human-authored validation. The submitted authorship, approval and date cells remain unchanged; the confirmation is stored as a separate declaration. The actual date of Howard’s review has not been separately confirmed. AI-assisted semantic screening identified substantive component reuse in six pairs: AV_002 (final-report deadline), AV_006 (failed reliance criteria), AV_007 (RFV autonomy duties), AV_012 (sworn translation), AV_014 (petition-characterization form) and AV_015 (PBRER obligations). Extra clauses do not establish independence of reused components. We recommend replacing these four answerable and two partly answerable pairs before freezing the planned 20-pair test. Fourteen pairs have no substantive reuse identified in this screen; that is not a guarantee of novelty. No question was selected or excluded using new model outputs, and no new model calls were performed.</w:t>
+      </w:r>
+    </w:p>
+    <w:p>
+      <w:r>
+        <w:t>A replacement submission received on 29 October 2026 supplied six bilingual pairs (12 rows) to address the initial prospective-set overlap findings. The corresponding author confirmed Howard’s personal review and approval of all 12 replacement rows. The submitted file retains AI authorship and stale pending-review cells; a separate approval declaration preserves both facts without overwriting the original. The actual date of Howard’s personal review was not separately confirmed. All replacement questions, classifications and references were incorporated into a versioned 40-row candidate; the other 28 rows were unchanged. All 12 replacement rows passed required-field and normalized support-quotation checks, with no normalized exact match against the 372-record development registry. AI-assisted semantic screening nevertheless identified three remaining overlaps: AV_002 reuses the trial-data retention requirement in DIRECT_07 and DR8_DIRECT_07; AV_012 reuses the country-of-manufacture registration condition and exception in EXTERNAL_016; and AV_015 reuses the 72-hour urgent-safety reporting deadline in EXTERNAL_005. Extra answer elements or an unavailable-detail clause do not remove the reused component. AV_006, AV_007 and AV_014 had no substantive reuse identified in this screen. Seventeen candidate pairs now have no substantive reuse identified; this is not certification of novelty or independent validation. Two answerable pairs (AV_002 and AV_012) and one partly answerable pair (AV_015) require replacement before freezing. The candidate still has the planned 12 answerable, four partly answerable and four unanswerable bilingual pairs, but is not a completed validation experiment. Source-eligibility and absence-search scope must also be reconciled with the six-document frozen index. No new generation or judge calls were made, and no selection used new model outcomes. Historical submissions, raw ratings and benchmark scores remain unchanged. The set remains AI-authored and coauthor-reviewed after earlier benchmark exposure.</w:t>
       </w:r>
     </w:p>
     <w:p>

</xml_diff>